<commit_message>
fix: enable seamless trial registration and auth feedback
</commit_message>
<xml_diff>
--- a/docs/SciPilot知识库与数据库实施交付说明.docx
+++ b/docs/SciPilot知识库与数据库实施交付说明.docx
@@ -79,13 +79,9 @@
       </w:r>
     </w:p>
     <w:p>
-      <w:r>
-        <w:br w:type="page"/>
-      </w:r>
-    </w:p>
-    <w:p>
       <w:pPr>
         <w:pStyle w:val="Heading1"/>
+        <w:pageBreakBefore/>
       </w:pPr>
       <w:r>
         <w:t>1. 最终结论</w:t>
@@ -1154,13 +1150,9 @@
       </w:r>
     </w:p>
     <w:p>
-      <w:r>
-        <w:br w:type="page"/>
-      </w:r>
-    </w:p>
-    <w:p>
       <w:pPr>
         <w:pStyle w:val="Heading1"/>
+        <w:pageBreakBefore/>
       </w:pPr>
       <w:r>
         <w:t>3. 数据库具体做了什么</w:t>
@@ -2341,13 +2333,9 @@
       </w:r>
     </w:p>
     <w:p>
-      <w:r>
-        <w:br w:type="page"/>
-      </w:r>
-    </w:p>
-    <w:p>
       <w:pPr>
         <w:pStyle w:val="Heading1"/>
+        <w:pageBreakBefore/>
       </w:pPr>
       <w:r>
         <w:t>5. 五个智能体如何调用知识</w:t>
@@ -2883,7 +2871,7 @@
           <w:color w:val="1F4D78"/>
           <w:sz w:val="21"/>
         </w:rPr>
-        <w:t>验证结论：</w:t>
+        <w:t>最新验证结论：Supabase Auth 健康检查 200；用户注册接口 200 并立即返回有效 JWT；requires_email_confirmation=false；/users/me 200；退出后使用同一账号再次登录 200。认证、数据库与前后端已经接通。</w:t>
       </w:r>
       <w:r>
         <w:rPr>
@@ -2891,7 +2879,6 @@
           <w:color w:val="172033"/>
           <w:sz w:val="21"/>
         </w:rPr>
-        <w:t>Supabase Auth 健康检查 200；临时已确认账户登录 200；/users/me 200；普通 Gmail 注册 200 并返回“需要邮箱确认”。认证和数据库均已接通。</w:t>
       </w:r>
     </w:p>
     <w:p>
@@ -2901,7 +2888,7 @@
           <w:color w:val="172033"/>
           <w:sz w:val="21"/>
         </w:rPr>
-        <w:t>注册曾出现 429，是 Supabase 默认邮件服务的发送频率限制，不是数据库表未连接。登录失败通常是邮箱尚未点击确认链接、密码不一致，或用户用另一个邮箱注册。密码不可从数据库读取。正式环境应配置自有 SMTP；本地测试应使用真实邮箱、完成确认后再登录。</w:t>
+        <w:t>当前试运行已启用 AUTH_AUTO_CONFIRM_EMAIL=true。FastAPI 使用仅保存在服务器端的 Service Role 权限创建已确认的 Supabase Auth 用户，再用 Publishable/Anon 权限换取该用户自己的 JWT，因此不发送验证邮件，也不受默认邮件发送额度影响。该模式不验证邮箱所有权；公开生产环境应配置自有 SMTP，并把开关改为 false。</w:t>
       </w:r>
     </w:p>
     <w:p>
@@ -3202,7 +3189,7 @@
                 <w:color w:val="172033"/>
                 <w:sz w:val="18"/>
               </w:rPr>
-              <w:t>13/13：切块、去重辅助、引用、防编造、公共/私有授权</w:t>
+              <w:t>19/19：切块、引用、防编造、公共/私有授权，以及自动确认注册、兼容模式和异常清理</w:t>
             </w:r>
           </w:p>
         </w:tc>
@@ -3470,13 +3457,9 @@
       </w:pPr>
     </w:p>
     <w:p>
-      <w:r>
-        <w:br w:type="page"/>
-      </w:r>
-    </w:p>
-    <w:p>
       <w:pPr>
         <w:pStyle w:val="Heading1"/>
+        <w:pageBreakBefore/>
       </w:pPr>
       <w:r>
         <w:t>8. 用户如何亲自验证</w:t>
@@ -3524,7 +3507,7 @@
           <w:color w:val="172033"/>
           <w:sz w:val="21"/>
         </w:rPr>
-        <w:t>用真实邮箱注册，点击 Supabase 确认邮件后登录；已有账户必须使用对应密码。</w:t>
+        <w:t>填写用户名、有效邮箱和同时包含字母与数字的 8–128 位密码；注册成功后系统会自动登录并进入仪表盘，不需要点击验证邮件。已有账户直接使用对应邮箱和密码登录。</w:t>
       </w:r>
     </w:p>
     <w:p>
@@ -4028,7 +4011,7 @@
                 <w:color w:val="172033"/>
                 <w:sz w:val="18"/>
               </w:rPr>
-              <w:t>需自有 SMTP、正式域名、Site URL 和 Redirect URL</w:t>
+              <w:t>当前试运行自动确认；生产需自有 SMTP、正式域名、Site URL、Redirect URL，并关闭自动确认</w:t>
             </w:r>
           </w:p>
         </w:tc>
@@ -4257,7 +4240,7 @@
           <w:color w:val="172033"/>
           <w:sz w:val="21"/>
         </w:rPr>
-        <w:t>backend/tests/：知识库和智能体授权/引用的 13 个测试。</w:t>
+        <w:t>backend/tests/：知识库、智能体授权/引用和自动确认注册的 19 个测试。</w:t>
       </w:r>
     </w:p>
     <w:p>
@@ -4379,7 +4362,7 @@
           <w:color w:val="172033"/>
           <w:sz w:val="21"/>
         </w:rPr>
-        <w:t>生产上线前配置 SMTP、HTTPS、严格 CORS、备份恢复、日志告警、速率限制和 CI/CD。</w:t>
+        <w:t>生产上线前应配置 SMTP，并将 AUTH_AUTO_CONFIRM_EMAIL 改为 false 以验证邮箱所有权；同时配置 HTTPS、严格 CORS、备份恢复、日志告警、速率限制和 CI/CD。</w:t>
       </w:r>
     </w:p>
     <w:p>

</xml_diff>